<commit_message>
chore: implement daily run fixes and notifications
</commit_message>
<xml_diff>
--- a/data/reports/Report_2026-05-12.docx
+++ b/data/reports/Report_2026-05-12.docx
@@ -12,12 +12,12 @@
     </w:p>
     <w:p>
       <w:r>
-        <w:t>Timestamp: 2026-05-12T13:29:25Z</w:t>
+        <w:t>Timestamp: 2026-05-12T14:34:14Z</w:t>
       </w:r>
     </w:p>
     <w:p>
       <w:r>
-        <w:t>Quote of the Day: If you want to see things just as they are, then you yourself must practice just as you are.</w:t>
+        <w:t>Quote of the Day: Why live an ordinary life, when you can live an extraordinary one.</w:t>
       </w:r>
     </w:p>
     <w:p>

</xml_diff>